<commit_message>
Update generated resume files
</commit_message>
<xml_diff>
--- a/john_blackmon_resume.docx
+++ b/john_blackmon_resume.docx
@@ -55,7 +55,7 @@
         </w:rPr>
         <w:t xml:space="preserve">   |   </w:t>
       </w:r>
-      <w:hyperlink w:history="1" r:id="rIdyun7s1ylrzddco9wkztrf">
+      <w:hyperlink w:history="1" r:id="rIdfm0k762ijeb_uzofjjok1">
         <w:r>
           <w:rPr>
             <w:rFonts w:ascii="Calibri" w:cs="Calibri" w:eastAsia="Calibri" w:hAnsi="Calibri"/>
@@ -92,7 +92,7 @@
         </w:pBdr>
         <w:spacing w:after="40"/>
       </w:pPr>
-      <w:hyperlink w:history="1" r:id="rIdyqzoilp79ot8bfhhh4rkn">
+      <w:hyperlink w:history="1" r:id="rIdtg1whezghb4p_js08qlkr">
         <w:r>
           <w:rPr>
             <w:rFonts w:ascii="Calibri" w:cs="Calibri" w:eastAsia="Calibri" w:hAnsi="Calibri"/>

</xml_diff>